<commit_message>
Ćw. 2: regresja logistyczna – raport w notebooku, testy, sprzątanie
Claude-Session: https://claude.ai/code/session_014z6GNAEBy2BiS6LNqchGLn
</commit_message>
<xml_diff>
--- a/cw2_regresja_logistyczna/NAUKA_cw2.docx
+++ b/cw2_regresja_logistyczna/NAUKA_cw2.docx
@@ -1023,7 +1023,7 @@
         <w:t xml:space="preserve"> </w:t>
       </w:r>
       <w:r>
-        <w:t xml:space="preserve">W raporcie, sekcja 6.2: kolumna</w:t>
+        <w:t xml:space="preserve">W raporcie, sekcja 6.2: kolumny</w:t>
       </w:r>
       <w:r>
         <w:t xml:space="preserve"> </w:t>
@@ -1038,7 +1038,7 @@
         <w:t xml:space="preserve"> </w:t>
       </w:r>
       <w:r>
-        <w:t xml:space="preserve">z jedną jedynką → waga</w:t>
+        <w:t xml:space="preserve">(1 jedynka) i</w:t>
       </w:r>
       <w:r>
         <w:t xml:space="preserve"> </w:t>
@@ -1047,13 +1047,13 @@
         <w:rPr>
           <w:rStyle w:val="VerbatimChar"/>
         </w:rPr>
-        <w:t xml:space="preserve">thal_brak</w:t>
-      </w:r>
-      <w:r>
-        <w:t xml:space="preserve"> </w:t>
-      </w:r>
-      <w:r>
-        <w:t xml:space="preserve">rośnie (co do modułu) jak log(epoki).</w:t>
+        <w:t xml:space="preserve">ca_brak</w:t>
+      </w:r>
+      <w:r>
+        <w:t xml:space="preserve"> </w:t>
+      </w:r>
+      <w:r>
+        <w:t xml:space="preserve">(2 jedynki), wszystkie w klasie 0 → ich wagi rosną (co do modułu) jak log(epoki).</w:t>
       </w:r>
       <w:r>
         <w:t xml:space="preserve"> </w:t>
@@ -1176,20 +1176,20 @@
         <w:pStyle w:val="Compact"/>
       </w:pPr>
       <w:r>
-        <w:t xml:space="preserve">w minimum: λ_max ≈ 0,195 →</w:t>
-      </w:r>
-      <w:r>
-        <w:t xml:space="preserve"> </w:t>
-      </w:r>
-      <w:r>
-        <w:rPr>
-          <w:bCs/>
-          <w:b/>
-        </w:rPr>
-        <w:t xml:space="preserve">2/λ_max ≈ 10,3</w:t>
-      </w:r>
-      <w:r>
-        <w:t xml:space="preserve">. Zgadza się z eksperymentem: α = 5 zbiega (14 epok), α = 20 oscyluje i nie zbiega.</w:t>
+        <w:t xml:space="preserve">w minimum: λ_max ≈ 0,206 →</w:t>
+      </w:r>
+      <w:r>
+        <w:t xml:space="preserve"> </w:t>
+      </w:r>
+      <w:r>
+        <w:rPr>
+          <w:bCs/>
+          <w:b/>
+        </w:rPr>
+        <w:t xml:space="preserve">2/λ_max ≈ 9,7</w:t>
+      </w:r>
+      <w:r>
+        <w:t xml:space="preserve">. Zgadza się z eksperymentem: α = 5 zbiega (18 epok), α = 20 oscyluje i nie zbiega.</w:t>
       </w:r>
     </w:p>
     <w:p>
@@ -1201,7 +1201,7 @@
         <w:pStyle w:val="Compact"/>
       </w:pPr>
       <w:r>
-        <w:t xml:space="preserve">w punkcie startowym w = 0: λ_max ≈ 0,89 → 2/λ_max ≈ 2,2. α = 5 jest „za duże” na starcie, ale BCE nie jest kwadratowa,</w:t>
+        <w:t xml:space="preserve">w punkcie startowym w = 0: λ_max ≈ 0,93 → 2/λ_max ≈ 2,2. α = 5 jest „za duże” na starcie, ale BCE nie jest kwadratowa,</w:t>
       </w:r>
       <w:r>
         <w:t xml:space="preserve"> </w:t>
@@ -1232,20 +1232,20 @@
         <w:t xml:space="preserve">niestandaryzowane</w:t>
       </w:r>
       <w:r>
-        <w:t xml:space="preserve">: λ_max ≈ 26 700 → 2/λ_max ≈</w:t>
-      </w:r>
-      <w:r>
-        <w:t xml:space="preserve"> </w:t>
-      </w:r>
-      <w:r>
-        <w:rPr>
-          <w:bCs/>
-          <w:b/>
-        </w:rPr>
-        <w:t xml:space="preserve">7,5·10⁻⁵</w:t>
-      </w:r>
-      <w:r>
-        <w:t xml:space="preserve">, a κ ≈ 2,8·10⁷.</w:t>
+        <w:t xml:space="preserve">: λ_max ≈ 26 900 → 2/λ_max ≈</w:t>
+      </w:r>
+      <w:r>
+        <w:t xml:space="preserve"> </w:t>
+      </w:r>
+      <w:r>
+        <w:rPr>
+          <w:bCs/>
+          <w:b/>
+        </w:rPr>
+        <w:t xml:space="preserve">7,4·10⁻⁵</w:t>
+      </w:r>
+      <w:r>
+        <w:t xml:space="preserve">, a κ ≈ 3,1·10⁷.</w:t>
       </w:r>
       <w:r>
         <w:t xml:space="preserve"> </w:t>
@@ -1331,7 +1331,7 @@
         <w:t xml:space="preserve"> </w:t>
       </w:r>
       <w:r>
-        <w:t xml:space="preserve">więc wskazuje „w poprzek doliny”, a nie wzdłuż niej → zygzaki. Standaryzacja zbliża poziomice do okręgów (κ z ~5·10⁶ do ~38 dla XᵀX).</w:t>
+        <w:t xml:space="preserve">więc wskazuje „w poprzek doliny”, a nie wzdłuż niej → zygzaki. Standaryzacja zbliża poziomice do okręgów (κ z ~5,5·10⁶ do ~46 dla XᵀX).</w:t>
       </w:r>
       <w:r>
         <w:t xml:space="preserve"> </w:t>
@@ -1407,7 +1407,7 @@
         <w:t xml:space="preserve"> </w:t>
       </w:r>
       <w:r>
-        <w:t xml:space="preserve">(σ = 10, stała 5): duże |z| → sigmoida nasycona → p ≈ 0 lub 1, koszt startowy ogromny (do ~10).</w:t>
+        <w:t xml:space="preserve">(σ = 10, stała 5): duże |z| → sigmoida nasycona → p ≈ 0 lub 1, koszt startowy ogromny (do ~10,5).</w:t>
       </w:r>
       <w:r>
         <w:t xml:space="preserve"> </w:t>
@@ -1447,7 +1447,7 @@
         <w:pStyle w:val="Compact"/>
       </w:pPr>
       <w:r>
-        <w:t xml:space="preserve">Z małymi inicjalizacjami różnice w liczbie epok są niewielkie (890–985 epok).</w:t>
+        <w:t xml:space="preserve">Z małymi inicjalizacjami różnice w liczbie epok są niewielkie (ok. 990–1170 epok).</w:t>
       </w:r>
     </w:p>
     <w:bookmarkEnd w:id="29"/>
@@ -1606,7 +1606,7 @@
         <w:t xml:space="preserve">przeuczenie (overfitting)</w:t>
       </w:r>
       <w:r>
-        <w:t xml:space="preserve">; u nas koszt walidacyjny ma minimum ok. epoki 111 i potem rośnie (0,386 → 0,433),</w:t>
+        <w:t xml:space="preserve">; u nas koszt walidacyjny ma minimum ok. epoki 133 i potem rośnie (0,387 → 0,437),</w:t>
       </w:r>
       <w:r>
         <w:t xml:space="preserve"> </w:t>
@@ -3223,7 +3223,7 @@
               <w:jc w:val="left"/>
             </w:pPr>
             <w:r>
-              <w:t xml:space="preserve">zbieżność do L* w 922 → 14 epok</w:t>
+              <w:t xml:space="preserve">zbieżność do L* w 1067 → 18 epok</w:t>
             </w:r>
           </w:p>
         </w:tc>
@@ -3249,7 +3249,7 @@
               <w:jc w:val="left"/>
             </w:pPr>
             <w:r>
-              <w:t xml:space="preserve">α za duże (≥ 20 &gt; 2/λ_max ≈ 10)</w:t>
+              <w:t xml:space="preserve">α za duże (≥ 20 &gt; 2/λ_max ≈ 9,7)</w:t>
             </w:r>
           </w:p>
         </w:tc>
@@ -3309,7 +3309,7 @@
               <w:jc w:val="left"/>
             </w:pPr>
             <w:r>
-              <w:t xml:space="preserve">nasycenie sigmoidy, start z L ≈ 8–10, setki–tysiące epok więcej</w:t>
+              <w:t xml:space="preserve">nasycenie sigmoidy, start z L ≈ 3–10,5, tysiące epok więcej</w:t>
             </w:r>
           </w:p>
         </w:tc>
@@ -3482,7 +3482,7 @@
         <w:pStyle w:val="BodyText"/>
       </w:pPr>
       <w:r>
-        <w:t xml:space="preserve">Jakość: F1 = 0,80 na teście (P = 0,786, R = 0,815), identycznie jak sklearn → poprawna implementacja.</w:t>
+        <w:t xml:space="preserve">Jakość: w minimum F1 = 0,772 na teście, identycznie jak sklearn uczony na tych samych 181 próbkach (wagi zgodne do 1,5·10⁻⁵) → poprawna implementacja. Model po 2000 epokach: F1 = 0,786.</w:t>
       </w:r>
     </w:p>
     <w:bookmarkEnd w:id="33"/>
@@ -3712,7 +3712,7 @@
         <w:t xml:space="preserve"> </w:t>
       </w:r>
       <w:r>
-        <w:t xml:space="preserve">α &lt; 2/λ_max(H); u nas ≈ 10 w pobliżu minimum.</w:t>
+        <w:t xml:space="preserve">α &lt; 2/λ_max(H); u nas ≈ 9,7 w pobliżu minimum.</w:t>
       </w:r>
     </w:p>
     <w:p>
@@ -3991,7 +3991,7 @@
         <w:t xml:space="preserve"> </w:t>
       </w:r>
       <w:r>
-        <w:t xml:space="preserve">Tak – u nas koszt walidacyjny rośnie po ~110 epokach, bo wagi rosną i predykcje są zbyt pewne.</w:t>
+        <w:t xml:space="preserve">Tak – u nas koszt walidacyjny rośnie po ~130 epokach, bo wagi rosną i predykcje są zbyt pewne.</w:t>
       </w:r>
     </w:p>
     <w:p>

</xml_diff>